<commit_message>
Replace the downloadable résumé files with the current print-safe versions.
</commit_message>
<xml_diff>
--- a/files/Benjamin_Gregg_Resume.docx
+++ b/files/Benjamin_Gregg_Resume.docx
@@ -25,7 +25,7 @@
           </w:tcPr>
           <w:p>
             <w:pPr>
-              <w:spacing w:line="620" w:lineRule="exact" w:after="100"/>
+              <w:spacing w:line="620" w:lineRule="exact" w:after="20"/>
             </w:pPr>
             <w:r>
               <w:rPr>
@@ -37,7 +37,7 @@
           </w:p>
           <w:p>
             <w:pPr>
-              <w:spacing w:after="100"/>
+              <w:spacing w:after="200" w:before="0"/>
             </w:pPr>
             <w:r>
               <w:rPr>
@@ -72,14 +72,17 @@
           </w:tcPr>
           <w:p>
             <w:pPr>
-              <w:spacing w:line="320" w:lineRule="exact" w:before="100"/>
+              <w:spacing w:line="340" w:lineRule="exact" w:before="0"/>
               <w:ind w:left="0" w:right="0"/>
               <w:jc w:val="left"/>
             </w:pPr>
             <w:r>
+              <w:rPr>
+                <w:position w:val="-2"/>
+              </w:rPr>
               <w:drawing>
                 <wp:inline xmlns:a="http://schemas.openxmlformats.org/drawingml/2006/main" xmlns:pic="http://schemas.openxmlformats.org/drawingml/2006/picture">
-                  <wp:extent cx="68580" cy="68580"/>
+                  <wp:extent cx="109728" cy="109728"/>
                   <wp:docPr id="1" name="Picture 1"/>
                   <wp:cNvGraphicFramePr>
                     <a:graphicFrameLocks noChangeAspect="1"/>
@@ -100,7 +103,7 @@
                         <pic:spPr>
                           <a:xfrm>
                             <a:off x="0" y="0"/>
-                            <a:ext cx="68580" cy="68580"/>
+                            <a:ext cx="109728" cy="109728"/>
                           </a:xfrm>
                           <a:prstGeom prst="rect"/>
                         </pic:spPr>
@@ -114,15 +117,18 @@
               <w:rPr>
                 <w:sz w:val="19"/>
               </w:rPr>
-              <w:t xml:space="preserve">  (614) 804-9208</w:t>
+              <w:t xml:space="preserve">    (614) 804-9208</w:t>
             </w:r>
             <w:r>
               <w:br/>
             </w:r>
             <w:r>
+              <w:rPr>
+                <w:position w:val="-2"/>
+              </w:rPr>
               <w:drawing>
                 <wp:inline xmlns:a="http://schemas.openxmlformats.org/drawingml/2006/main" xmlns:pic="http://schemas.openxmlformats.org/drawingml/2006/picture">
-                  <wp:extent cx="68580" cy="68580"/>
+                  <wp:extent cx="109728" cy="109728"/>
                   <wp:docPr id="2" name="Picture 2"/>
                   <wp:cNvGraphicFramePr>
                     <a:graphicFrameLocks noChangeAspect="1"/>
@@ -143,7 +149,7 @@
                         <pic:spPr>
                           <a:xfrm>
                             <a:off x="0" y="0"/>
-                            <a:ext cx="68580" cy="68580"/>
+                            <a:ext cx="109728" cy="109728"/>
                           </a:xfrm>
                           <a:prstGeom prst="rect"/>
                         </pic:spPr>
@@ -157,7 +163,7 @@
               <w:rPr>
                 <w:sz w:val="19"/>
               </w:rPr>
-              <w:t xml:space="preserve">  </w:t>
+              <w:t xml:space="preserve">    </w:t>
             </w:r>
             <w:hyperlink r:id="rId13">
               <w:r>
@@ -171,9 +177,12 @@
               <w:br/>
             </w:r>
             <w:r>
+              <w:rPr>
+                <w:position w:val="-2"/>
+              </w:rPr>
               <w:drawing>
                 <wp:inline xmlns:a="http://schemas.openxmlformats.org/drawingml/2006/main" xmlns:pic="http://schemas.openxmlformats.org/drawingml/2006/picture">
-                  <wp:extent cx="68580" cy="68580"/>
+                  <wp:extent cx="109728" cy="109728"/>
                   <wp:docPr id="3" name="Picture 3"/>
                   <wp:cNvGraphicFramePr>
                     <a:graphicFrameLocks noChangeAspect="1"/>
@@ -194,7 +203,7 @@
                         <pic:spPr>
                           <a:xfrm>
                             <a:off x="0" y="0"/>
-                            <a:ext cx="68580" cy="68580"/>
+                            <a:ext cx="109728" cy="109728"/>
                           </a:xfrm>
                           <a:prstGeom prst="rect"/>
                         </pic:spPr>
@@ -208,15 +217,18 @@
               <w:rPr>
                 <w:sz w:val="19"/>
               </w:rPr>
-              <w:t xml:space="preserve">  Columbus, Ohio</w:t>
+              <w:t xml:space="preserve">    Columbus, Ohio</w:t>
             </w:r>
             <w:r>
               <w:br/>
             </w:r>
             <w:r>
+              <w:rPr>
+                <w:position w:val="-2"/>
+              </w:rPr>
               <w:drawing>
                 <wp:inline xmlns:a="http://schemas.openxmlformats.org/drawingml/2006/main" xmlns:pic="http://schemas.openxmlformats.org/drawingml/2006/picture">
-                  <wp:extent cx="68580" cy="68580"/>
+                  <wp:extent cx="109728" cy="109728"/>
                   <wp:docPr id="4" name="Picture 4"/>
                   <wp:cNvGraphicFramePr>
                     <a:graphicFrameLocks noChangeAspect="1"/>
@@ -237,7 +249,7 @@
                         <pic:spPr>
                           <a:xfrm>
                             <a:off x="0" y="0"/>
-                            <a:ext cx="68580" cy="68580"/>
+                            <a:ext cx="109728" cy="109728"/>
                           </a:xfrm>
                           <a:prstGeom prst="rect"/>
                         </pic:spPr>
@@ -251,7 +263,7 @@
               <w:rPr>
                 <w:sz w:val="19"/>
               </w:rPr>
-              <w:t xml:space="preserve">  </w:t>
+              <w:t xml:space="preserve">    </w:t>
             </w:r>
             <w:hyperlink r:id="rId14">
               <w:r>
@@ -265,9 +277,12 @@
               <w:br/>
             </w:r>
             <w:r>
+              <w:rPr>
+                <w:position w:val="-2"/>
+              </w:rPr>
               <w:drawing>
                 <wp:inline xmlns:a="http://schemas.openxmlformats.org/drawingml/2006/main" xmlns:pic="http://schemas.openxmlformats.org/drawingml/2006/picture">
-                  <wp:extent cx="68580" cy="68580"/>
+                  <wp:extent cx="109728" cy="109728"/>
                   <wp:docPr id="5" name="Picture 5"/>
                   <wp:cNvGraphicFramePr>
                     <a:graphicFrameLocks noChangeAspect="1"/>
@@ -288,7 +303,7 @@
                         <pic:spPr>
                           <a:xfrm>
                             <a:off x="0" y="0"/>
-                            <a:ext cx="68580" cy="68580"/>
+                            <a:ext cx="109728" cy="109728"/>
                           </a:xfrm>
                           <a:prstGeom prst="rect"/>
                         </pic:spPr>
@@ -299,7 +314,7 @@
               </w:drawing>
             </w:r>
             <w:r>
-              <w:t xml:space="preserve">  </w:t>
+              <w:t xml:space="preserve">    </w:t>
             </w:r>
             <w:hyperlink r:id="rId16">
               <w:r>
@@ -500,15 +515,44 @@
     <w:p>
       <w:pPr>
         <w:widowControl w:val="0"/>
+        <w:spacing w:after="0"/>
         <w:ind w:left="173" w:hanging="173"/>
       </w:pPr>
       <w:r>
-        <w:t>•  Collaborated on the design and implementation of a provider-agnostic C#/.NET bank data platform with connection redundancy and provider fallback, ultimately supporting millions of bank connections and billions of transactions.</w:t>
+        <w:rPr>
+          <w:b w:val="0"/>
+        </w:rPr>
+        <w:t xml:space="preserve">•  Collaborated on the design and implementation of a provider-agnostic C#/.NET bank data platform with connection redundancy and provider fallback, ultimately supporting </w:t>
+      </w:r>
+      <w:r>
+        <w:rPr>
+          <w:b/>
+        </w:rPr>
+        <w:t>millions of bank connections</w:t>
+      </w:r>
+      <w:r>
+        <w:rPr>
+          <w:b w:val="0"/>
+        </w:rPr>
+        <w:t xml:space="preserve"> and </w:t>
+      </w:r>
+      <w:r>
+        <w:rPr>
+          <w:b/>
+        </w:rPr>
+        <w:t>billions of transactions</w:t>
+      </w:r>
+      <w:r>
+        <w:rPr>
+          <w:b w:val="0"/>
+        </w:rPr>
+        <w:t>.</w:t>
       </w:r>
     </w:p>
     <w:p>
       <w:pPr>
         <w:widowControl w:val="0"/>
+        <w:spacing w:after="0"/>
         <w:ind w:left="173" w:hanging="173"/>
       </w:pPr>
       <w:r>
@@ -518,42 +562,57 @@
     <w:p>
       <w:pPr>
         <w:widowControl w:val="0"/>
+        <w:spacing w:after="0"/>
         <w:ind w:left="173" w:hanging="173"/>
       </w:pPr>
       <w:r>
-        <w:t>•  Delivered approximately $3M in annual savings by routing bank connections to lower-cost providers based on the financial institution.</w:t>
+        <w:rPr>
+          <w:b w:val="0"/>
+        </w:rPr>
+        <w:t xml:space="preserve">•  Delivered </w:t>
+      </w:r>
+      <w:r>
+        <w:rPr>
+          <w:b/>
+        </w:rPr>
+        <w:t>$3M</w:t>
+      </w:r>
+      <w:r>
+        <w:rPr>
+          <w:b w:val="0"/>
+        </w:rPr>
+        <w:t xml:space="preserve"> in annual savings by implementing institution-specific routing to lower-cost bank data providers.</w:t>
       </w:r>
     </w:p>
     <w:p>
       <w:pPr>
         <w:widowControl w:val="0"/>
+        <w:spacing w:after="0"/>
         <w:ind w:left="173" w:hanging="173"/>
       </w:pPr>
       <w:r>
-        <w:t>•  Built automated, billing-aware connection pruning jobs contributing to $1.2M in annual savings without impacting user experience.</w:t>
+        <w:rPr>
+          <w:b w:val="0"/>
+        </w:rPr>
+        <w:t xml:space="preserve">•  Built automated, billing-aware connection pruning jobs contributing to </w:t>
+      </w:r>
+      <w:r>
+        <w:rPr>
+          <w:b/>
+        </w:rPr>
+        <w:t>$1.2M</w:t>
+      </w:r>
+      <w:r>
+        <w:rPr>
+          <w:b w:val="0"/>
+        </w:rPr>
+        <w:t xml:space="preserve"> in annual savings without impacting user experience.</w:t>
       </w:r>
     </w:p>
     <w:p>
       <w:pPr>
         <w:widowControl w:val="0"/>
-        <w:ind w:left="173" w:hanging="173"/>
-      </w:pPr>
-      <w:r>
-        <w:t>•  Served as the bank data platform’s primary technical owner, co-leading technical projects, troubleshooting complex issues, and resolving production incidents.</w:t>
-      </w:r>
-    </w:p>
-    <w:p>
-      <w:pPr>
-        <w:widowControl w:val="0"/>
-        <w:ind w:left="173" w:hanging="173"/>
-      </w:pPr>
-      <w:r>
-        <w:t>•  Interviewed, onboarded, and mentored engineers on bank integrations, service architecture, and production operations.</w:t>
-      </w:r>
-    </w:p>
-    <w:p>
-      <w:pPr>
-        <w:widowControl w:val="0"/>
+        <w:spacing w:after="0"/>
         <w:ind w:left="173" w:hanging="173"/>
       </w:pPr>
       <w:r>
@@ -563,6 +622,7 @@
     <w:p>
       <w:pPr>
         <w:widowControl w:val="0"/>
+        <w:spacing w:after="0"/>
         <w:ind w:left="173" w:hanging="173"/>
       </w:pPr>
       <w:r>
@@ -572,10 +632,21 @@
     <w:p>
       <w:pPr>
         <w:widowControl w:val="0"/>
+        <w:spacing w:after="0"/>
         <w:ind w:left="173" w:hanging="173"/>
       </w:pPr>
       <w:r>
-        <w:t>•  Led the transition of bank data platform development and production ownership to the Bangkok engineering team through knowledge transfer; remained an escalation contact after the handoff.</w:t>
+        <w:t>•  Served as the bank data platform’s primary technical owner, co-leading projects and resolving complex production issues; interviewed, onboarded, and mentored engineers on integrations, architecture, and operations.</w:t>
+      </w:r>
+    </w:p>
+    <w:p>
+      <w:pPr>
+        <w:widowControl w:val="0"/>
+        <w:spacing w:after="0"/>
+        <w:ind w:left="173" w:hanging="173"/>
+      </w:pPr>
+      <w:r>
+        <w:t>•  Transferred platform development and production ownership to the Bangkok engineering team through knowledge transfer, remaining an escalation contact after the handoff.</w:t>
       </w:r>
     </w:p>
     <w:p>
@@ -588,21 +659,77 @@
         <w:rPr>
           <w:b/>
         </w:rPr>
-        <w:t>Platform Modernization &amp; Efficiency</w:t>
+        <w:t>Platform Engineering &amp; Efficiency</w:t>
       </w:r>
     </w:p>
     <w:p>
       <w:pPr>
         <w:widowControl w:val="0"/>
+        <w:spacing w:after="0"/>
         <w:ind w:left="173" w:hanging="173"/>
       </w:pPr>
       <w:r>
-        <w:t>•  Migrated legacy .NET Framework web services, message processors, and scheduled jobs from EC2 to modern .NET microservices on Kubernetes to improve scalability; used Cloudflare Workers to gradually shift API traffic during rollout.</w:t>
+        <w:t xml:space="preserve">•  Used AI-assisted analysis to identify noisy and oversized logs. Implemented targeted reductions that lowered Datadog costs by </w:t>
+      </w:r>
+      <w:r>
+        <w:rPr>
+          <w:b/>
+        </w:rPr>
+        <w:t>over $50K</w:t>
+      </w:r>
+      <w:r>
+        <w:t xml:space="preserve"> annually while preserving diagnostic value.</w:t>
       </w:r>
     </w:p>
     <w:p>
       <w:pPr>
         <w:widowControl w:val="0"/>
+        <w:spacing w:after="0"/>
+        <w:ind w:left="173" w:hanging="173"/>
+      </w:pPr>
+      <w:r>
+        <w:t>•  Integrated an agentic API to assess users’ employment status and inform eligibility for EarnIn products.</w:t>
+      </w:r>
+    </w:p>
+    <w:p>
+      <w:pPr>
+        <w:widowControl w:val="0"/>
+        <w:spacing w:after="0"/>
+        <w:ind w:left="173" w:hanging="173"/>
+      </w:pPr>
+      <w:r>
+        <w:rPr>
+          <w:b w:val="0"/>
+        </w:rPr>
+        <w:t xml:space="preserve">•  Optimized service resources and scaling policies, saving </w:t>
+      </w:r>
+      <w:r>
+        <w:rPr>
+          <w:b/>
+        </w:rPr>
+        <w:t>tens of thousands of dollars</w:t>
+      </w:r>
+      <w:r>
+        <w:rPr>
+          <w:b w:val="0"/>
+        </w:rPr>
+        <w:t xml:space="preserve"> annually while improving scaling reliability.</w:t>
+      </w:r>
+    </w:p>
+    <w:p>
+      <w:pPr>
+        <w:widowControl w:val="0"/>
+        <w:spacing w:after="0"/>
+        <w:ind w:left="173" w:hanging="173"/>
+      </w:pPr>
+      <w:r>
+        <w:t>•  Modernized legacy .NET Framework services, message processors, and scheduled jobs into .NET microservices on Kubernetes, using Cloudflare Workers to gradually shift API traffic during rollout.</w:t>
+      </w:r>
+    </w:p>
+    <w:p>
+      <w:pPr>
+        <w:widowControl w:val="0"/>
+        <w:spacing w:after="0"/>
         <w:ind w:left="173" w:hanging="173"/>
       </w:pPr>
       <w:r>
@@ -612,29 +739,11 @@
     <w:p>
       <w:pPr>
         <w:widowControl w:val="0"/>
-        <w:ind w:left="173" w:hanging="173"/>
-      </w:pPr>
-      <w:r>
-        <w:t>•  Migrated database-intensive scheduled jobs to Databricks using replicated data, reducing production database load; verified matching results before switching production processing.</w:t>
-      </w:r>
-    </w:p>
-    <w:p>
-      <w:pPr>
-        <w:widowControl w:val="0"/>
-        <w:ind w:left="173" w:hanging="173"/>
-      </w:pPr>
-      <w:r>
-        <w:t>•  Optimized service resources and scaling policies, saving tens of thousands of dollars annually while improving scaling reliability.</w:t>
-      </w:r>
-    </w:p>
-    <w:p>
-      <w:pPr>
-        <w:widowControl w:val="0"/>
         <w:spacing w:after="0"/>
         <w:ind w:left="173" w:hanging="173"/>
       </w:pPr>
       <w:r>
-        <w:t>•  Reduced log volume and record size, lowering Datadog costs by over $50K annually.</w:t>
+        <w:t>•  Migrated database-intensive scheduled jobs to Python on Databricks using replicated data, reducing production database load; verified matching results before switching production processing.</w:t>
       </w:r>
     </w:p>
     <w:p>
@@ -782,7 +891,7 @@
     </w:p>
     <w:sectPr>
       <w:pgSz w:w="12240" w:h="15840"/>
-      <w:pgMar w:top="504" w:right="792" w:bottom="720" w:left="792" w:header="720" w:footer="720" w:gutter="0"/>
+      <w:pgMar w:top="720" w:right="792" w:bottom="720" w:left="792" w:header="720" w:footer="720" w:gutter="0"/>
       <w:cols w:space="720"/>
       <w:docGrid w:linePitch="360"/>
     </w:sectPr>

</xml_diff>

<commit_message>
Refresh the downloadable résumé files with the latest print-safe versions.
</commit_message>
<xml_diff>
--- a/files/Benjamin_Gregg_Resume.docx
+++ b/files/Benjamin_Gregg_Resume.docx
@@ -117,8 +117,16 @@
               <w:rPr>
                 <w:sz w:val="19"/>
               </w:rPr>
-              <w:t xml:space="preserve">    (614) 804-9208</w:t>
+              <w:t xml:space="preserve">    </w:t>
             </w:r>
+            <w:hyperlink r:id="rId18">
+              <w:r>
+                <w:rPr>
+                  <w:sz w:val="19"/>
+                </w:rPr>
+                <w:t>(614) 804-9208</w:t>
+              </w:r>
+            </w:hyperlink>
             <w:r>
               <w:br/>
             </w:r>

</xml_diff>